<commit_message>
docs: restaura cláusulas importantes no contrato AppChurch (versão intermediária)
Co-Authored-By: Claude Opus 5.5 <noreply@anthropic.com>
Claude-Session: https://claude.ai/code/session_01HBHD2F5GTP6aA8kmfJvLPZ
</commit_message>
<xml_diff>
--- a/docs/contratos/Contrato_AppChurch_Modelo.docx
+++ b/docs/contratos/Contrato_AppChurch_Modelo.docx
@@ -278,7 +278,7 @@
         <w:rPr>
           <w:rFonts w:ascii="Calibri" w:cs="Calibri" w:eastAsia="Calibri" w:hAnsi="Calibri"/>
         </w:rPr>
-        <w:t xml:space="preserve">, para gestão de membros, células, unidades, discipulado e relatórios da IGREJA, com suporte técnico e atualizações incluídos.</w:t>
+        <w:t xml:space="preserve"> (software como serviço), destinada à gestão eclesiástica da IGREJA, compreendendo: (a) cadastro e gestão de membros, visitantes e líderes; (b) gestão de células, unidades/congregações e discipulado; (c) relatórios e indicadores de crescimento; (d) notificações e comunicação com os membros; e (e) suporte técnico e atualizações.</w:t>
       </w:r>
     </w:p>
     <w:p>
@@ -298,7 +298,27 @@
         <w:rPr>
           <w:rFonts w:ascii="Calibri" w:cs="Calibri" w:eastAsia="Calibri" w:hAnsi="Calibri"/>
         </w:rPr>
-        <w:t xml:space="preserve">O software, a marca e demais elementos da plataforma permanecem de propriedade exclusiva da APPCHURCH, sendo vedado à IGREJA copiá-los, revendê-los ou sublicenciá-los.</w:t>
+        <w:t xml:space="preserve">A licença não transfere propriedade intelectual. O software, seu código, a marca e o layout permanecem de titularidade exclusiva da APPCHURCH.</w:t>
+      </w:r>
+    </w:p>
+    <w:p>
+      <w:pPr>
+        <w:spacing w:after="80" w:line="276"/>
+        <w:jc w:val="both"/>
+      </w:pPr>
+      <w:r>
+        <w:rPr>
+          <w:rFonts w:ascii="Calibri" w:cs="Calibri" w:eastAsia="Calibri" w:hAnsi="Calibri"/>
+          <w:b/>
+          <w:bCs/>
+        </w:rPr>
+        <w:t xml:space="preserve">1.3. </w:t>
+      </w:r>
+      <w:r>
+        <w:rPr>
+          <w:rFonts w:ascii="Calibri" w:cs="Calibri" w:eastAsia="Calibri" w:hAnsi="Calibri"/>
+        </w:rPr>
+        <w:t xml:space="preserve">A APPCHURCH poderá incluir ou aprimorar funcionalidades a qualquer tempo, sem prejuízo das funcionalidades essenciais contratadas.</w:t>
       </w:r>
     </w:p>
     <w:p>
@@ -660,7 +680,7 @@
         <w:rPr>
           <w:rFonts w:ascii="Calibri" w:cs="Calibri" w:eastAsia="Calibri" w:hAnsi="Calibri"/>
         </w:rPr>
-        <w:t xml:space="preserve">O valor será reajustado anualmente pelo IPCA/IBGE, salvo disposição diversa nas Condições Especiais.</w:t>
+        <w:t xml:space="preserve">O primeiro pagamento vence no primeiro vencimento após o início da vigência, e os demais nos meses subsequentes, enquanto vigorar este contrato.</w:t>
       </w:r>
     </w:p>
     <w:p>
@@ -680,7 +700,47 @@
         <w:rPr>
           <w:rFonts w:ascii="Calibri" w:cs="Calibri" w:eastAsia="Calibri" w:hAnsi="Calibri"/>
         </w:rPr>
-        <w:t xml:space="preserve">O atraso gera multa de 2% e juros de 1% ao mês. Após 15 (quinze) dias de atraso, o acesso poderá ser suspenso, mediante aviso, até a regularização, sem perda dos dados.</w:t>
+        <w:t xml:space="preserve">O valor será reajustado a cada 12 (doze) meses, contados do início da vigência, pela variação do IPCA/IBGE ou índice que o substitua, salvo disposição diversa nas Condições Especiais.</w:t>
+      </w:r>
+    </w:p>
+    <w:p>
+      <w:pPr>
+        <w:spacing w:after="80" w:line="276"/>
+        <w:jc w:val="both"/>
+      </w:pPr>
+      <w:r>
+        <w:rPr>
+          <w:rFonts w:ascii="Calibri" w:cs="Calibri" w:eastAsia="Calibri" w:hAnsi="Calibri"/>
+          <w:b/>
+          <w:bCs/>
+        </w:rPr>
+        <w:t xml:space="preserve">2.3. </w:t>
+      </w:r>
+      <w:r>
+        <w:rPr>
+          <w:rFonts w:ascii="Calibri" w:cs="Calibri" w:eastAsia="Calibri" w:hAnsi="Calibri"/>
+        </w:rPr>
+        <w:t xml:space="preserve">O atraso sujeita a IGREJA a multa de 2% (dois por cento) sobre o valor devido e juros de mora de 1% (um por cento) ao mês, pro rata die.</w:t>
+      </w:r>
+    </w:p>
+    <w:p>
+      <w:pPr>
+        <w:spacing w:after="80" w:line="276"/>
+        <w:jc w:val="both"/>
+      </w:pPr>
+      <w:r>
+        <w:rPr>
+          <w:rFonts w:ascii="Calibri" w:cs="Calibri" w:eastAsia="Calibri" w:hAnsi="Calibri"/>
+          <w:b/>
+          <w:bCs/>
+        </w:rPr>
+        <w:t xml:space="preserve">2.4. </w:t>
+      </w:r>
+      <w:r>
+        <w:rPr>
+          <w:rFonts w:ascii="Calibri" w:cs="Calibri" w:eastAsia="Calibri" w:hAnsi="Calibri"/>
+        </w:rPr>
+        <w:t xml:space="preserve">Após 15 (quinze) dias de atraso, a APPCHURCH poderá, mediante aviso por e-mail ou WhatsApp, suspender o acesso à plataforma até a regularização, sem perda dos dados da IGREJA.</w:t>
       </w:r>
     </w:p>
     <w:p>
@@ -805,7 +865,7 @@
           <w:sz w:val="22"/>
           <w:szCs w:val="22"/>
         </w:rPr>
-        <w:t xml:space="preserve">CLÁUSULA 4ª – OBRIGAÇÕES DAS PARTES</w:t>
+        <w:t xml:space="preserve">CLÁUSULA 4ª – OBRIGAÇÕES DA APPCHURCH</w:t>
       </w:r>
     </w:p>
     <w:p>
@@ -825,7 +885,7 @@
         <w:rPr>
           <w:rFonts w:ascii="Calibri" w:cs="Calibri" w:eastAsia="Calibri" w:hAnsi="Calibri"/>
         </w:rPr>
-        <w:t xml:space="preserve">A APPCHURCH se compromete a manter a plataforma disponível (ressalvadas manutenções e falhas de terceiros), prestar suporte por WhatsApp/e-mail em horário comercial, fazer backups periódicos e manter sigilo sobre os dados da IGREJA.</w:t>
+        <w:t xml:space="preserve">Manter a plataforma disponível 24 (vinte e quatro) horas por dia, ressalvadas manutenções programadas, falhas de terceiros (internet, hospedagem, energia) e casos fortuitos ou de força maior.</w:t>
       </w:r>
     </w:p>
     <w:p>
@@ -845,7 +905,7 @@
         <w:rPr>
           <w:rFonts w:ascii="Calibri" w:cs="Calibri" w:eastAsia="Calibri" w:hAnsi="Calibri"/>
         </w:rPr>
-        <w:t xml:space="preserve">A IGREJA se compromete a pagar em dia, manter sob sigilo as senhas de acesso, inserir apenas dados obtidos de forma lícita e informar o número de células quando este for critério de preço.</w:t>
+        <w:t xml:space="preserve">Prestar suporte técnico por WhatsApp e/ou e-mail, em dias úteis e horário comercial, e realizar backups periódicos dos dados.</w:t>
       </w:r>
     </w:p>
     <w:p>
@@ -865,7 +925,7 @@
         <w:rPr>
           <w:rFonts w:ascii="Calibri" w:cs="Calibri" w:eastAsia="Calibri" w:hAnsi="Calibri"/>
         </w:rPr>
-        <w:t xml:space="preserve">Para fins da LGPD (Lei nº 13.709/2018), a IGREJA é controladora e a APPCHURCH operadora dos dados pessoais, que serão usados apenas para a execução deste contrato e, ao seu término, exportados à IGREJA mediante solicitação em até 30 dias.</w:t>
+        <w:t xml:space="preserve">Manter sigilo sobre os dados da IGREJA e comunicar com 30 (trinta) dias de antecedência qualquer alteração de valores não prevista neste contrato.</w:t>
       </w:r>
     </w:p>
     <w:p>
@@ -885,7 +945,7 @@
           <w:sz w:val="22"/>
           <w:szCs w:val="22"/>
         </w:rPr>
-        <w:t xml:space="preserve">CLÁUSULA 5ª – VIGÊNCIA E RESCISÃO</w:t>
+        <w:t xml:space="preserve">CLÁUSULA 5ª – OBRIGAÇÕES DA IGREJA</w:t>
       </w:r>
     </w:p>
     <w:p>
@@ -905,7 +965,47 @@
         <w:rPr>
           <w:rFonts w:ascii="Calibri" w:cs="Calibri" w:eastAsia="Calibri" w:hAnsi="Calibri"/>
         </w:rPr>
-        <w:t xml:space="preserve">Este contrato vigora por prazo indeterminado e pode ser rescindido por qualquer das partes, sem multa, com aviso prévio de 30 (trinta) dias, sendo devidas as mensalidades até o fim do aviso.</w:t>
+        <w:t xml:space="preserve">Efetuar pontualmente os pagamentos e manter seus dados cadastrais atualizados, inclusive o número de células, quando for critério de preço.</w:t>
+      </w:r>
+    </w:p>
+    <w:p>
+      <w:pPr>
+        <w:spacing w:after="80" w:line="276"/>
+        <w:jc w:val="both"/>
+      </w:pPr>
+      <w:r>
+        <w:rPr>
+          <w:rFonts w:ascii="Calibri" w:cs="Calibri" w:eastAsia="Calibri" w:hAnsi="Calibri"/>
+          <w:b/>
+          <w:bCs/>
+        </w:rPr>
+        <w:t xml:space="preserve">5.2. </w:t>
+      </w:r>
+      <w:r>
+        <w:rPr>
+          <w:rFonts w:ascii="Calibri" w:cs="Calibri" w:eastAsia="Calibri" w:hAnsi="Calibri"/>
+        </w:rPr>
+        <w:t xml:space="preserve">Manter sob sigilo logins e senhas, respondendo pelo uso da plataforma por seus usuários.</w:t>
+      </w:r>
+    </w:p>
+    <w:p>
+      <w:pPr>
+        <w:spacing w:after="80" w:line="276"/>
+        <w:jc w:val="both"/>
+      </w:pPr>
+      <w:r>
+        <w:rPr>
+          <w:rFonts w:ascii="Calibri" w:cs="Calibri" w:eastAsia="Calibri" w:hAnsi="Calibri"/>
+          <w:b/>
+          <w:bCs/>
+        </w:rPr>
+        <w:t xml:space="preserve">5.3. </w:t>
+      </w:r>
+      <w:r>
+        <w:rPr>
+          <w:rFonts w:ascii="Calibri" w:cs="Calibri" w:eastAsia="Calibri" w:hAnsi="Calibri"/>
+        </w:rPr>
+        <w:t xml:space="preserve">Não copiar, revender, sublicenciar, modificar ou realizar engenharia reversa do software.</w:t>
       </w:r>
     </w:p>
     <w:p>
@@ -925,7 +1025,7 @@
           <w:sz w:val="22"/>
           <w:szCs w:val="22"/>
         </w:rPr>
-        <w:t xml:space="preserve">CLÁUSULA 6ª – FORO</w:t>
+        <w:t xml:space="preserve">CLÁUSULA 6ª – PROTEÇÃO DE DADOS (LGPD)</w:t>
       </w:r>
     </w:p>
     <w:p>
@@ -940,6 +1040,226 @@
           <w:bCs/>
         </w:rPr>
         <w:t xml:space="preserve">6.1. </w:t>
+      </w:r>
+      <w:r>
+        <w:rPr>
+          <w:rFonts w:ascii="Calibri" w:cs="Calibri" w:eastAsia="Calibri" w:hAnsi="Calibri"/>
+        </w:rPr>
+        <w:t xml:space="preserve">Nos termos da Lei nº 13.709/2018, a IGREJA é controladora e a APPCHURCH operadora dos dados pessoais de membros, visitantes e líderes, tratando-os apenas para a execução deste contrato e conforme as instruções da IGREJA, que se responsabiliza pela licitude da coleta.</w:t>
+      </w:r>
+    </w:p>
+    <w:p>
+      <w:pPr>
+        <w:spacing w:after="80" w:line="276"/>
+        <w:jc w:val="both"/>
+      </w:pPr>
+      <w:r>
+        <w:rPr>
+          <w:rFonts w:ascii="Calibri" w:cs="Calibri" w:eastAsia="Calibri" w:hAnsi="Calibri"/>
+          <w:b/>
+          <w:bCs/>
+        </w:rPr>
+        <w:t xml:space="preserve">6.2. </w:t>
+      </w:r>
+      <w:r>
+        <w:rPr>
+          <w:rFonts w:ascii="Calibri" w:cs="Calibri" w:eastAsia="Calibri" w:hAnsi="Calibri"/>
+        </w:rPr>
+        <w:t xml:space="preserve">A APPCHURCH adotará medidas de segurança adequadas e comunicará à IGREJA qualquer incidente de segurança relevante.</w:t>
+      </w:r>
+    </w:p>
+    <w:p>
+      <w:pPr>
+        <w:spacing w:after="80" w:line="276"/>
+        <w:jc w:val="both"/>
+      </w:pPr>
+      <w:r>
+        <w:rPr>
+          <w:rFonts w:ascii="Calibri" w:cs="Calibri" w:eastAsia="Calibri" w:hAnsi="Calibri"/>
+          <w:b/>
+          <w:bCs/>
+        </w:rPr>
+        <w:t xml:space="preserve">6.3. </w:t>
+      </w:r>
+      <w:r>
+        <w:rPr>
+          <w:rFonts w:ascii="Calibri" w:cs="Calibri" w:eastAsia="Calibri" w:hAnsi="Calibri"/>
+        </w:rPr>
+        <w:t xml:space="preserve">Encerrado o contrato, a IGREJA poderá solicitar a exportação de seus dados em até 30 (trinta) dias; após esse prazo, os dados poderão ser excluídos definitivamente.</w:t>
+      </w:r>
+    </w:p>
+    <w:p>
+      <w:pPr>
+        <w:keepNext/>
+        <w:pBdr>
+          <w:bottom w:val="single" w:color="B8C4D2" w:sz="4" w:space="2"/>
+        </w:pBdr>
+        <w:spacing w:after="80" w:before="180"/>
+      </w:pPr>
+      <w:r>
+        <w:rPr>
+          <w:rFonts w:ascii="Calibri" w:cs="Calibri" w:eastAsia="Calibri" w:hAnsi="Calibri"/>
+          <w:b/>
+          <w:bCs/>
+          <w:color w:val="041E3A"/>
+          <w:sz w:val="22"/>
+          <w:szCs w:val="22"/>
+        </w:rPr>
+        <w:t xml:space="preserve">CLÁUSULA 7ª – VIGÊNCIA E RESCISÃO</w:t>
+      </w:r>
+    </w:p>
+    <w:p>
+      <w:pPr>
+        <w:spacing w:after="80" w:line="276"/>
+        <w:jc w:val="both"/>
+      </w:pPr>
+      <w:r>
+        <w:rPr>
+          <w:rFonts w:ascii="Calibri" w:cs="Calibri" w:eastAsia="Calibri" w:hAnsi="Calibri"/>
+          <w:b/>
+          <w:bCs/>
+        </w:rPr>
+        <w:t xml:space="preserve">7.1. </w:t>
+      </w:r>
+      <w:r>
+        <w:rPr>
+          <w:rFonts w:ascii="Calibri" w:cs="Calibri" w:eastAsia="Calibri" w:hAnsi="Calibri"/>
+        </w:rPr>
+        <w:t xml:space="preserve">Este contrato vigora por prazo indeterminado a partir do início da vigência.</w:t>
+      </w:r>
+    </w:p>
+    <w:p>
+      <w:pPr>
+        <w:spacing w:after="80" w:line="276"/>
+        <w:jc w:val="both"/>
+      </w:pPr>
+      <w:r>
+        <w:rPr>
+          <w:rFonts w:ascii="Calibri" w:cs="Calibri" w:eastAsia="Calibri" w:hAnsi="Calibri"/>
+          <w:b/>
+          <w:bCs/>
+        </w:rPr>
+        <w:t xml:space="preserve">7.2. </w:t>
+      </w:r>
+      <w:r>
+        <w:rPr>
+          <w:rFonts w:ascii="Calibri" w:cs="Calibri" w:eastAsia="Calibri" w:hAnsi="Calibri"/>
+        </w:rPr>
+        <w:t xml:space="preserve">Qualquer das partes poderá rescindi-lo, sem multa, com aviso prévio por escrito de 30 (trinta) dias, sendo devidas as mensalidades até o fim do aviso.</w:t>
+      </w:r>
+    </w:p>
+    <w:p>
+      <w:pPr>
+        <w:spacing w:after="80" w:line="276"/>
+        <w:jc w:val="both"/>
+      </w:pPr>
+      <w:r>
+        <w:rPr>
+          <w:rFonts w:ascii="Calibri" w:cs="Calibri" w:eastAsia="Calibri" w:hAnsi="Calibri"/>
+          <w:b/>
+          <w:bCs/>
+        </w:rPr>
+        <w:t xml:space="preserve">7.3. </w:t>
+      </w:r>
+      <w:r>
+        <w:rPr>
+          <w:rFonts w:ascii="Calibri" w:cs="Calibri" w:eastAsia="Calibri" w:hAnsi="Calibri"/>
+        </w:rPr>
+        <w:t xml:space="preserve">O contrato poderá ser rescindido de imediato em caso de descumprimento de cláusula não sanado em 10 (dez) dias após notificação, ou de inadimplência superior a 60 (sessenta) dias.</w:t>
+      </w:r>
+    </w:p>
+    <w:p>
+      <w:pPr>
+        <w:keepNext/>
+        <w:pBdr>
+          <w:bottom w:val="single" w:color="B8C4D2" w:sz="4" w:space="2"/>
+        </w:pBdr>
+        <w:spacing w:after="80" w:before="180"/>
+      </w:pPr>
+      <w:r>
+        <w:rPr>
+          <w:rFonts w:ascii="Calibri" w:cs="Calibri" w:eastAsia="Calibri" w:hAnsi="Calibri"/>
+          <w:b/>
+          <w:bCs/>
+          <w:color w:val="041E3A"/>
+          <w:sz w:val="22"/>
+          <w:szCs w:val="22"/>
+        </w:rPr>
+        <w:t xml:space="preserve">CLÁUSULA 8ª – DISPOSIÇÕES GERAIS E FORO</w:t>
+      </w:r>
+    </w:p>
+    <w:p>
+      <w:pPr>
+        <w:spacing w:after="80" w:line="276"/>
+        <w:jc w:val="both"/>
+      </w:pPr>
+      <w:r>
+        <w:rPr>
+          <w:rFonts w:ascii="Calibri" w:cs="Calibri" w:eastAsia="Calibri" w:hAnsi="Calibri"/>
+          <w:b/>
+          <w:bCs/>
+        </w:rPr>
+        <w:t xml:space="preserve">8.1. </w:t>
+      </w:r>
+      <w:r>
+        <w:rPr>
+          <w:rFonts w:ascii="Calibri" w:cs="Calibri" w:eastAsia="Calibri" w:hAnsi="Calibri"/>
+        </w:rPr>
+        <w:t xml:space="preserve">A responsabilidade da APPCHURCH por eventuais danos fica limitada ao valor pago pela IGREJA nos 12 (doze) meses anteriores ao fato.</w:t>
+      </w:r>
+    </w:p>
+    <w:p>
+      <w:pPr>
+        <w:spacing w:after="80" w:line="276"/>
+        <w:jc w:val="both"/>
+      </w:pPr>
+      <w:r>
+        <w:rPr>
+          <w:rFonts w:ascii="Calibri" w:cs="Calibri" w:eastAsia="Calibri" w:hAnsi="Calibri"/>
+          <w:b/>
+          <w:bCs/>
+        </w:rPr>
+        <w:t xml:space="preserve">8.2. </w:t>
+      </w:r>
+      <w:r>
+        <w:rPr>
+          <w:rFonts w:ascii="Calibri" w:cs="Calibri" w:eastAsia="Calibri" w:hAnsi="Calibri"/>
+        </w:rPr>
+        <w:t xml:space="preserve">A tolerância quanto ao descumprimento de qualquer obrigação não implica renúncia de direitos. As comunicações por e-mail ou WhatsApp, nos contatos deste contrato, são válidas.</w:t>
+      </w:r>
+    </w:p>
+    <w:p>
+      <w:pPr>
+        <w:spacing w:after="80" w:line="276"/>
+        <w:jc w:val="both"/>
+      </w:pPr>
+      <w:r>
+        <w:rPr>
+          <w:rFonts w:ascii="Calibri" w:cs="Calibri" w:eastAsia="Calibri" w:hAnsi="Calibri"/>
+          <w:b/>
+          <w:bCs/>
+        </w:rPr>
+        <w:t xml:space="preserve">8.3. </w:t>
+      </w:r>
+      <w:r>
+        <w:rPr>
+          <w:rFonts w:ascii="Calibri" w:cs="Calibri" w:eastAsia="Calibri" w:hAnsi="Calibri"/>
+        </w:rPr>
+        <w:t xml:space="preserve">As partes reconhecem a validade da assinatura eletrônica deste contrato (Lei nº 14.063/2020).</w:t>
+      </w:r>
+    </w:p>
+    <w:p>
+      <w:pPr>
+        <w:spacing w:after="80" w:line="276"/>
+        <w:jc w:val="both"/>
+      </w:pPr>
+      <w:r>
+        <w:rPr>
+          <w:rFonts w:ascii="Calibri" w:cs="Calibri" w:eastAsia="Calibri" w:hAnsi="Calibri"/>
+          <w:b/>
+          <w:bCs/>
+        </w:rPr>
+        <w:t xml:space="preserve">8.4. </w:t>
       </w:r>
       <w:r>
         <w:rPr>
@@ -959,7 +1279,7 @@
         <w:rPr>
           <w:rFonts w:ascii="Calibri" w:cs="Calibri" w:eastAsia="Calibri" w:hAnsi="Calibri"/>
         </w:rPr>
-        <w:t xml:space="preserve">. As partes aceitam a assinatura deste contrato por meio eletrônico.</w:t>
+        <w:t xml:space="preserve"> para dirimir quaisquer questões oriundas deste contrato.</w:t>
       </w:r>
     </w:p>
     <w:p>

</xml_diff>

<commit_message>
docs: volta para a versão enxuta do contrato AppChurch
Co-Authored-By: Claude Opus 5.5 <noreply@anthropic.com>
Claude-Session: https://claude.ai/code/session_01HBHD2F5GTP6aA8kmfJvLPZ
</commit_message>
<xml_diff>
--- a/docs/contratos/Contrato_AppChurch_Modelo.docx
+++ b/docs/contratos/Contrato_AppChurch_Modelo.docx
@@ -278,7 +278,7 @@
         <w:rPr>
           <w:rFonts w:ascii="Calibri" w:cs="Calibri" w:eastAsia="Calibri" w:hAnsi="Calibri"/>
         </w:rPr>
-        <w:t xml:space="preserve"> (software como serviço), destinada à gestão eclesiástica da IGREJA, compreendendo: (a) cadastro e gestão de membros, visitantes e líderes; (b) gestão de células, unidades/congregações e discipulado; (c) relatórios e indicadores de crescimento; (d) notificações e comunicação com os membros; e (e) suporte técnico e atualizações.</w:t>
+        <w:t xml:space="preserve">, para gestão de membros, células, unidades, discipulado e relatórios da IGREJA, com suporte técnico e atualizações incluídos.</w:t>
       </w:r>
     </w:p>
     <w:p>
@@ -298,27 +298,7 @@
         <w:rPr>
           <w:rFonts w:ascii="Calibri" w:cs="Calibri" w:eastAsia="Calibri" w:hAnsi="Calibri"/>
         </w:rPr>
-        <w:t xml:space="preserve">A licença não transfere propriedade intelectual. O software, seu código, a marca e o layout permanecem de titularidade exclusiva da APPCHURCH.</w:t>
-      </w:r>
-    </w:p>
-    <w:p>
-      <w:pPr>
-        <w:spacing w:after="80" w:line="276"/>
-        <w:jc w:val="both"/>
-      </w:pPr>
-      <w:r>
-        <w:rPr>
-          <w:rFonts w:ascii="Calibri" w:cs="Calibri" w:eastAsia="Calibri" w:hAnsi="Calibri"/>
-          <w:b/>
-          <w:bCs/>
-        </w:rPr>
-        <w:t xml:space="preserve">1.3. </w:t>
-      </w:r>
-      <w:r>
-        <w:rPr>
-          <w:rFonts w:ascii="Calibri" w:cs="Calibri" w:eastAsia="Calibri" w:hAnsi="Calibri"/>
-        </w:rPr>
-        <w:t xml:space="preserve">A APPCHURCH poderá incluir ou aprimorar funcionalidades a qualquer tempo, sem prejuízo das funcionalidades essenciais contratadas.</w:t>
+        <w:t xml:space="preserve">O software, a marca e demais elementos da plataforma permanecem de propriedade exclusiva da APPCHURCH, sendo vedado à IGREJA copiá-los, revendê-los ou sublicenciá-los.</w:t>
       </w:r>
     </w:p>
     <w:p>
@@ -680,7 +660,7 @@
         <w:rPr>
           <w:rFonts w:ascii="Calibri" w:cs="Calibri" w:eastAsia="Calibri" w:hAnsi="Calibri"/>
         </w:rPr>
-        <w:t xml:space="preserve">O primeiro pagamento vence no primeiro vencimento após o início da vigência, e os demais nos meses subsequentes, enquanto vigorar este contrato.</w:t>
+        <w:t xml:space="preserve">O valor será reajustado anualmente pelo IPCA/IBGE, salvo disposição diversa nas Condições Especiais.</w:t>
       </w:r>
     </w:p>
     <w:p>
@@ -700,47 +680,7 @@
         <w:rPr>
           <w:rFonts w:ascii="Calibri" w:cs="Calibri" w:eastAsia="Calibri" w:hAnsi="Calibri"/>
         </w:rPr>
-        <w:t xml:space="preserve">O valor será reajustado a cada 12 (doze) meses, contados do início da vigência, pela variação do IPCA/IBGE ou índice que o substitua, salvo disposição diversa nas Condições Especiais.</w:t>
-      </w:r>
-    </w:p>
-    <w:p>
-      <w:pPr>
-        <w:spacing w:after="80" w:line="276"/>
-        <w:jc w:val="both"/>
-      </w:pPr>
-      <w:r>
-        <w:rPr>
-          <w:rFonts w:ascii="Calibri" w:cs="Calibri" w:eastAsia="Calibri" w:hAnsi="Calibri"/>
-          <w:b/>
-          <w:bCs/>
-        </w:rPr>
-        <w:t xml:space="preserve">2.3. </w:t>
-      </w:r>
-      <w:r>
-        <w:rPr>
-          <w:rFonts w:ascii="Calibri" w:cs="Calibri" w:eastAsia="Calibri" w:hAnsi="Calibri"/>
-        </w:rPr>
-        <w:t xml:space="preserve">O atraso sujeita a IGREJA a multa de 2% (dois por cento) sobre o valor devido e juros de mora de 1% (um por cento) ao mês, pro rata die.</w:t>
-      </w:r>
-    </w:p>
-    <w:p>
-      <w:pPr>
-        <w:spacing w:after="80" w:line="276"/>
-        <w:jc w:val="both"/>
-      </w:pPr>
-      <w:r>
-        <w:rPr>
-          <w:rFonts w:ascii="Calibri" w:cs="Calibri" w:eastAsia="Calibri" w:hAnsi="Calibri"/>
-          <w:b/>
-          <w:bCs/>
-        </w:rPr>
-        <w:t xml:space="preserve">2.4. </w:t>
-      </w:r>
-      <w:r>
-        <w:rPr>
-          <w:rFonts w:ascii="Calibri" w:cs="Calibri" w:eastAsia="Calibri" w:hAnsi="Calibri"/>
-        </w:rPr>
-        <w:t xml:space="preserve">Após 15 (quinze) dias de atraso, a APPCHURCH poderá, mediante aviso por e-mail ou WhatsApp, suspender o acesso à plataforma até a regularização, sem perda dos dados da IGREJA.</w:t>
+        <w:t xml:space="preserve">O atraso gera multa de 2% e juros de 1% ao mês. Após 15 (quinze) dias de atraso, o acesso poderá ser suspenso, mediante aviso, até a regularização, sem perda dos dados.</w:t>
       </w:r>
     </w:p>
     <w:p>
@@ -865,7 +805,7 @@
           <w:sz w:val="22"/>
           <w:szCs w:val="22"/>
         </w:rPr>
-        <w:t xml:space="preserve">CLÁUSULA 4ª – OBRIGAÇÕES DA APPCHURCH</w:t>
+        <w:t xml:space="preserve">CLÁUSULA 4ª – OBRIGAÇÕES DAS PARTES</w:t>
       </w:r>
     </w:p>
     <w:p>
@@ -885,7 +825,7 @@
         <w:rPr>
           <w:rFonts w:ascii="Calibri" w:cs="Calibri" w:eastAsia="Calibri" w:hAnsi="Calibri"/>
         </w:rPr>
-        <w:t xml:space="preserve">Manter a plataforma disponível 24 (vinte e quatro) horas por dia, ressalvadas manutenções programadas, falhas de terceiros (internet, hospedagem, energia) e casos fortuitos ou de força maior.</w:t>
+        <w:t xml:space="preserve">A APPCHURCH se compromete a manter a plataforma disponível (ressalvadas manutenções e falhas de terceiros), prestar suporte por WhatsApp/e-mail em horário comercial, fazer backups periódicos e manter sigilo sobre os dados da IGREJA.</w:t>
       </w:r>
     </w:p>
     <w:p>
@@ -905,7 +845,7 @@
         <w:rPr>
           <w:rFonts w:ascii="Calibri" w:cs="Calibri" w:eastAsia="Calibri" w:hAnsi="Calibri"/>
         </w:rPr>
-        <w:t xml:space="preserve">Prestar suporte técnico por WhatsApp e/ou e-mail, em dias úteis e horário comercial, e realizar backups periódicos dos dados.</w:t>
+        <w:t xml:space="preserve">A IGREJA se compromete a pagar em dia, manter sob sigilo as senhas de acesso, inserir apenas dados obtidos de forma lícita e informar o número de células quando este for critério de preço.</w:t>
       </w:r>
     </w:p>
     <w:p>
@@ -925,7 +865,7 @@
         <w:rPr>
           <w:rFonts w:ascii="Calibri" w:cs="Calibri" w:eastAsia="Calibri" w:hAnsi="Calibri"/>
         </w:rPr>
-        <w:t xml:space="preserve">Manter sigilo sobre os dados da IGREJA e comunicar com 30 (trinta) dias de antecedência qualquer alteração de valores não prevista neste contrato.</w:t>
+        <w:t xml:space="preserve">Para fins da LGPD (Lei nº 13.709/2018), a IGREJA é controladora e a APPCHURCH operadora dos dados pessoais, que serão usados apenas para a execução deste contrato e, ao seu término, exportados à IGREJA mediante solicitação em até 30 dias.</w:t>
       </w:r>
     </w:p>
     <w:p>
@@ -945,7 +885,7 @@
           <w:sz w:val="22"/>
           <w:szCs w:val="22"/>
         </w:rPr>
-        <w:t xml:space="preserve">CLÁUSULA 5ª – OBRIGAÇÕES DA IGREJA</w:t>
+        <w:t xml:space="preserve">CLÁUSULA 5ª – VIGÊNCIA E RESCISÃO</w:t>
       </w:r>
     </w:p>
     <w:p>
@@ -965,47 +905,7 @@
         <w:rPr>
           <w:rFonts w:ascii="Calibri" w:cs="Calibri" w:eastAsia="Calibri" w:hAnsi="Calibri"/>
         </w:rPr>
-        <w:t xml:space="preserve">Efetuar pontualmente os pagamentos e manter seus dados cadastrais atualizados, inclusive o número de células, quando for critério de preço.</w:t>
-      </w:r>
-    </w:p>
-    <w:p>
-      <w:pPr>
-        <w:spacing w:after="80" w:line="276"/>
-        <w:jc w:val="both"/>
-      </w:pPr>
-      <w:r>
-        <w:rPr>
-          <w:rFonts w:ascii="Calibri" w:cs="Calibri" w:eastAsia="Calibri" w:hAnsi="Calibri"/>
-          <w:b/>
-          <w:bCs/>
-        </w:rPr>
-        <w:t xml:space="preserve">5.2. </w:t>
-      </w:r>
-      <w:r>
-        <w:rPr>
-          <w:rFonts w:ascii="Calibri" w:cs="Calibri" w:eastAsia="Calibri" w:hAnsi="Calibri"/>
-        </w:rPr>
-        <w:t xml:space="preserve">Manter sob sigilo logins e senhas, respondendo pelo uso da plataforma por seus usuários.</w:t>
-      </w:r>
-    </w:p>
-    <w:p>
-      <w:pPr>
-        <w:spacing w:after="80" w:line="276"/>
-        <w:jc w:val="both"/>
-      </w:pPr>
-      <w:r>
-        <w:rPr>
-          <w:rFonts w:ascii="Calibri" w:cs="Calibri" w:eastAsia="Calibri" w:hAnsi="Calibri"/>
-          <w:b/>
-          <w:bCs/>
-        </w:rPr>
-        <w:t xml:space="preserve">5.3. </w:t>
-      </w:r>
-      <w:r>
-        <w:rPr>
-          <w:rFonts w:ascii="Calibri" w:cs="Calibri" w:eastAsia="Calibri" w:hAnsi="Calibri"/>
-        </w:rPr>
-        <w:t xml:space="preserve">Não copiar, revender, sublicenciar, modificar ou realizar engenharia reversa do software.</w:t>
+        <w:t xml:space="preserve">Este contrato vigora por prazo indeterminado e pode ser rescindido por qualquer das partes, sem multa, com aviso prévio de 30 (trinta) dias, sendo devidas as mensalidades até o fim do aviso.</w:t>
       </w:r>
     </w:p>
     <w:p>
@@ -1025,7 +925,7 @@
           <w:sz w:val="22"/>
           <w:szCs w:val="22"/>
         </w:rPr>
-        <w:t xml:space="preserve">CLÁUSULA 6ª – PROTEÇÃO DE DADOS (LGPD)</w:t>
+        <w:t xml:space="preserve">CLÁUSULA 6ª – FORO</w:t>
       </w:r>
     </w:p>
     <w:p>
@@ -1045,226 +945,6 @@
         <w:rPr>
           <w:rFonts w:ascii="Calibri" w:cs="Calibri" w:eastAsia="Calibri" w:hAnsi="Calibri"/>
         </w:rPr>
-        <w:t xml:space="preserve">Nos termos da Lei nº 13.709/2018, a IGREJA é controladora e a APPCHURCH operadora dos dados pessoais de membros, visitantes e líderes, tratando-os apenas para a execução deste contrato e conforme as instruções da IGREJA, que se responsabiliza pela licitude da coleta.</w:t>
-      </w:r>
-    </w:p>
-    <w:p>
-      <w:pPr>
-        <w:spacing w:after="80" w:line="276"/>
-        <w:jc w:val="both"/>
-      </w:pPr>
-      <w:r>
-        <w:rPr>
-          <w:rFonts w:ascii="Calibri" w:cs="Calibri" w:eastAsia="Calibri" w:hAnsi="Calibri"/>
-          <w:b/>
-          <w:bCs/>
-        </w:rPr>
-        <w:t xml:space="preserve">6.2. </w:t>
-      </w:r>
-      <w:r>
-        <w:rPr>
-          <w:rFonts w:ascii="Calibri" w:cs="Calibri" w:eastAsia="Calibri" w:hAnsi="Calibri"/>
-        </w:rPr>
-        <w:t xml:space="preserve">A APPCHURCH adotará medidas de segurança adequadas e comunicará à IGREJA qualquer incidente de segurança relevante.</w:t>
-      </w:r>
-    </w:p>
-    <w:p>
-      <w:pPr>
-        <w:spacing w:after="80" w:line="276"/>
-        <w:jc w:val="both"/>
-      </w:pPr>
-      <w:r>
-        <w:rPr>
-          <w:rFonts w:ascii="Calibri" w:cs="Calibri" w:eastAsia="Calibri" w:hAnsi="Calibri"/>
-          <w:b/>
-          <w:bCs/>
-        </w:rPr>
-        <w:t xml:space="preserve">6.3. </w:t>
-      </w:r>
-      <w:r>
-        <w:rPr>
-          <w:rFonts w:ascii="Calibri" w:cs="Calibri" w:eastAsia="Calibri" w:hAnsi="Calibri"/>
-        </w:rPr>
-        <w:t xml:space="preserve">Encerrado o contrato, a IGREJA poderá solicitar a exportação de seus dados em até 30 (trinta) dias; após esse prazo, os dados poderão ser excluídos definitivamente.</w:t>
-      </w:r>
-    </w:p>
-    <w:p>
-      <w:pPr>
-        <w:keepNext/>
-        <w:pBdr>
-          <w:bottom w:val="single" w:color="B8C4D2" w:sz="4" w:space="2"/>
-        </w:pBdr>
-        <w:spacing w:after="80" w:before="180"/>
-      </w:pPr>
-      <w:r>
-        <w:rPr>
-          <w:rFonts w:ascii="Calibri" w:cs="Calibri" w:eastAsia="Calibri" w:hAnsi="Calibri"/>
-          <w:b/>
-          <w:bCs/>
-          <w:color w:val="041E3A"/>
-          <w:sz w:val="22"/>
-          <w:szCs w:val="22"/>
-        </w:rPr>
-        <w:t xml:space="preserve">CLÁUSULA 7ª – VIGÊNCIA E RESCISÃO</w:t>
-      </w:r>
-    </w:p>
-    <w:p>
-      <w:pPr>
-        <w:spacing w:after="80" w:line="276"/>
-        <w:jc w:val="both"/>
-      </w:pPr>
-      <w:r>
-        <w:rPr>
-          <w:rFonts w:ascii="Calibri" w:cs="Calibri" w:eastAsia="Calibri" w:hAnsi="Calibri"/>
-          <w:b/>
-          <w:bCs/>
-        </w:rPr>
-        <w:t xml:space="preserve">7.1. </w:t>
-      </w:r>
-      <w:r>
-        <w:rPr>
-          <w:rFonts w:ascii="Calibri" w:cs="Calibri" w:eastAsia="Calibri" w:hAnsi="Calibri"/>
-        </w:rPr>
-        <w:t xml:space="preserve">Este contrato vigora por prazo indeterminado a partir do início da vigência.</w:t>
-      </w:r>
-    </w:p>
-    <w:p>
-      <w:pPr>
-        <w:spacing w:after="80" w:line="276"/>
-        <w:jc w:val="both"/>
-      </w:pPr>
-      <w:r>
-        <w:rPr>
-          <w:rFonts w:ascii="Calibri" w:cs="Calibri" w:eastAsia="Calibri" w:hAnsi="Calibri"/>
-          <w:b/>
-          <w:bCs/>
-        </w:rPr>
-        <w:t xml:space="preserve">7.2. </w:t>
-      </w:r>
-      <w:r>
-        <w:rPr>
-          <w:rFonts w:ascii="Calibri" w:cs="Calibri" w:eastAsia="Calibri" w:hAnsi="Calibri"/>
-        </w:rPr>
-        <w:t xml:space="preserve">Qualquer das partes poderá rescindi-lo, sem multa, com aviso prévio por escrito de 30 (trinta) dias, sendo devidas as mensalidades até o fim do aviso.</w:t>
-      </w:r>
-    </w:p>
-    <w:p>
-      <w:pPr>
-        <w:spacing w:after="80" w:line="276"/>
-        <w:jc w:val="both"/>
-      </w:pPr>
-      <w:r>
-        <w:rPr>
-          <w:rFonts w:ascii="Calibri" w:cs="Calibri" w:eastAsia="Calibri" w:hAnsi="Calibri"/>
-          <w:b/>
-          <w:bCs/>
-        </w:rPr>
-        <w:t xml:space="preserve">7.3. </w:t>
-      </w:r>
-      <w:r>
-        <w:rPr>
-          <w:rFonts w:ascii="Calibri" w:cs="Calibri" w:eastAsia="Calibri" w:hAnsi="Calibri"/>
-        </w:rPr>
-        <w:t xml:space="preserve">O contrato poderá ser rescindido de imediato em caso de descumprimento de cláusula não sanado em 10 (dez) dias após notificação, ou de inadimplência superior a 60 (sessenta) dias.</w:t>
-      </w:r>
-    </w:p>
-    <w:p>
-      <w:pPr>
-        <w:keepNext/>
-        <w:pBdr>
-          <w:bottom w:val="single" w:color="B8C4D2" w:sz="4" w:space="2"/>
-        </w:pBdr>
-        <w:spacing w:after="80" w:before="180"/>
-      </w:pPr>
-      <w:r>
-        <w:rPr>
-          <w:rFonts w:ascii="Calibri" w:cs="Calibri" w:eastAsia="Calibri" w:hAnsi="Calibri"/>
-          <w:b/>
-          <w:bCs/>
-          <w:color w:val="041E3A"/>
-          <w:sz w:val="22"/>
-          <w:szCs w:val="22"/>
-        </w:rPr>
-        <w:t xml:space="preserve">CLÁUSULA 8ª – DISPOSIÇÕES GERAIS E FORO</w:t>
-      </w:r>
-    </w:p>
-    <w:p>
-      <w:pPr>
-        <w:spacing w:after="80" w:line="276"/>
-        <w:jc w:val="both"/>
-      </w:pPr>
-      <w:r>
-        <w:rPr>
-          <w:rFonts w:ascii="Calibri" w:cs="Calibri" w:eastAsia="Calibri" w:hAnsi="Calibri"/>
-          <w:b/>
-          <w:bCs/>
-        </w:rPr>
-        <w:t xml:space="preserve">8.1. </w:t>
-      </w:r>
-      <w:r>
-        <w:rPr>
-          <w:rFonts w:ascii="Calibri" w:cs="Calibri" w:eastAsia="Calibri" w:hAnsi="Calibri"/>
-        </w:rPr>
-        <w:t xml:space="preserve">A responsabilidade da APPCHURCH por eventuais danos fica limitada ao valor pago pela IGREJA nos 12 (doze) meses anteriores ao fato.</w:t>
-      </w:r>
-    </w:p>
-    <w:p>
-      <w:pPr>
-        <w:spacing w:after="80" w:line="276"/>
-        <w:jc w:val="both"/>
-      </w:pPr>
-      <w:r>
-        <w:rPr>
-          <w:rFonts w:ascii="Calibri" w:cs="Calibri" w:eastAsia="Calibri" w:hAnsi="Calibri"/>
-          <w:b/>
-          <w:bCs/>
-        </w:rPr>
-        <w:t xml:space="preserve">8.2. </w:t>
-      </w:r>
-      <w:r>
-        <w:rPr>
-          <w:rFonts w:ascii="Calibri" w:cs="Calibri" w:eastAsia="Calibri" w:hAnsi="Calibri"/>
-        </w:rPr>
-        <w:t xml:space="preserve">A tolerância quanto ao descumprimento de qualquer obrigação não implica renúncia de direitos. As comunicações por e-mail ou WhatsApp, nos contatos deste contrato, são válidas.</w:t>
-      </w:r>
-    </w:p>
-    <w:p>
-      <w:pPr>
-        <w:spacing w:after="80" w:line="276"/>
-        <w:jc w:val="both"/>
-      </w:pPr>
-      <w:r>
-        <w:rPr>
-          <w:rFonts w:ascii="Calibri" w:cs="Calibri" w:eastAsia="Calibri" w:hAnsi="Calibri"/>
-          <w:b/>
-          <w:bCs/>
-        </w:rPr>
-        <w:t xml:space="preserve">8.3. </w:t>
-      </w:r>
-      <w:r>
-        <w:rPr>
-          <w:rFonts w:ascii="Calibri" w:cs="Calibri" w:eastAsia="Calibri" w:hAnsi="Calibri"/>
-        </w:rPr>
-        <w:t xml:space="preserve">As partes reconhecem a validade da assinatura eletrônica deste contrato (Lei nº 14.063/2020).</w:t>
-      </w:r>
-    </w:p>
-    <w:p>
-      <w:pPr>
-        <w:spacing w:after="80" w:line="276"/>
-        <w:jc w:val="both"/>
-      </w:pPr>
-      <w:r>
-        <w:rPr>
-          <w:rFonts w:ascii="Calibri" w:cs="Calibri" w:eastAsia="Calibri" w:hAnsi="Calibri"/>
-          <w:b/>
-          <w:bCs/>
-        </w:rPr>
-        <w:t xml:space="preserve">8.4. </w:t>
-      </w:r>
-      <w:r>
-        <w:rPr>
-          <w:rFonts w:ascii="Calibri" w:cs="Calibri" w:eastAsia="Calibri" w:hAnsi="Calibri"/>
-        </w:rPr>
         <w:t xml:space="preserve">Fica eleito o foro da Comarca de </w:t>
       </w:r>
       <w:r>
@@ -1279,7 +959,7 @@
         <w:rPr>
           <w:rFonts w:ascii="Calibri" w:cs="Calibri" w:eastAsia="Calibri" w:hAnsi="Calibri"/>
         </w:rPr>
-        <w:t xml:space="preserve"> para dirimir quaisquer questões oriundas deste contrato.</w:t>
+        <w:t xml:space="preserve">. As partes aceitam a assinatura deste contrato por meio eletrônico.</w:t>
       </w:r>
     </w:p>
     <w:p>

</xml_diff>